<commit_message>
Aggiunta Use Case (Nicolas) + Gantt (Samuele) e aggiornamento documentazione
</commit_message>
<xml_diff>
--- a/3_Documentazione/Documentazione_FleshNSteel.docx
+++ b/3_Documentazione/Documentazione_FleshNSteel.docx
@@ -10162,10 +10162,80 @@
     </w:p>
     <w:p>
       <w:pPr>
-        <w:rPr>
-          <w:lang w:val="it-IT"/>
-        </w:rPr>
-      </w:pPr>
+        <w:keepNext/>
+      </w:pPr>
+      <w:r>
+        <w:rPr>
+          <w:lang w:val="it-IT"/>
+        </w:rPr>
+        <w:drawing>
+          <wp:inline distT="0" distB="0" distL="0" distR="0" wp14:anchorId="1E1C8195" wp14:editId="267FCDE0">
+            <wp:extent cx="6120130" cy="5017135"/>
+            <wp:effectExtent l="0" t="0" r="0" b="0"/>
+            <wp:docPr id="4" name="Immagine 4"/>
+            <wp:cNvGraphicFramePr>
+              <a:graphicFrameLocks xmlns:a="http://schemas.openxmlformats.org/drawingml/2006/main" noChangeAspect="1"/>
+            </wp:cNvGraphicFramePr>
+            <a:graphic xmlns:a="http://schemas.openxmlformats.org/drawingml/2006/main">
+              <a:graphicData uri="http://schemas.openxmlformats.org/drawingml/2006/picture">
+                <pic:pic xmlns:pic="http://schemas.openxmlformats.org/drawingml/2006/picture">
+                  <pic:nvPicPr>
+                    <pic:cNvPr id="1" name=""/>
+                    <pic:cNvPicPr/>
+                  </pic:nvPicPr>
+                  <pic:blipFill>
+                    <a:blip r:embed="rId8"/>
+                    <a:stretch>
+                      <a:fillRect/>
+                    </a:stretch>
+                  </pic:blipFill>
+                  <pic:spPr>
+                    <a:xfrm>
+                      <a:off x="0" y="0"/>
+                      <a:ext cx="6120130" cy="5017135"/>
+                    </a:xfrm>
+                    <a:prstGeom prst="rect">
+                      <a:avLst/>
+                    </a:prstGeom>
+                  </pic:spPr>
+                </pic:pic>
+              </a:graphicData>
+            </a:graphic>
+          </wp:inline>
+        </w:drawing>
+      </w:r>
+    </w:p>
+    <w:p>
+      <w:pPr>
+        <w:pStyle w:val="Didascalia"/>
+        <w:rPr>
+          <w:lang w:val="it-IT"/>
+        </w:rPr>
+      </w:pPr>
+      <w:r>
+        <w:t xml:space="preserve">Figura </w:t>
+      </w:r>
+      <w:r>
+        <w:fldChar w:fldCharType="begin"/>
+      </w:r>
+      <w:r>
+        <w:instrText xml:space="preserve"> SEQ Figura \* ARABIC </w:instrText>
+      </w:r>
+      <w:r>
+        <w:fldChar w:fldCharType="separate"/>
+      </w:r>
+      <w:r>
+        <w:rPr>
+          <w:noProof/>
+        </w:rPr>
+        <w:t>1</w:t>
+      </w:r>
+      <w:r>
+        <w:fldChar w:fldCharType="end"/>
+      </w:r>
+      <w:r>
+        <w:t>: Schema Use Case</w:t>
+      </w:r>
     </w:p>
     <w:p>
       <w:pPr>
@@ -10173,137 +10243,87 @@
       </w:pPr>
       <w:bookmarkStart w:id="9" w:name="_Toc94790450"/>
       <w:r>
+        <w:lastRenderedPageBreak/>
         <w:t>Pianificazione</w:t>
       </w:r>
       <w:bookmarkEnd w:id="9"/>
     </w:p>
-    <w:tbl>
-      <w:tblPr>
-        <w:tblW w:w="0" w:type="auto"/>
-        <w:tblBorders>
-          <w:top w:val="single" w:sz="4" w:space="0" w:color="auto"/>
-          <w:left w:val="single" w:sz="4" w:space="0" w:color="auto"/>
-          <w:bottom w:val="single" w:sz="4" w:space="0" w:color="auto"/>
-          <w:right w:val="single" w:sz="4" w:space="0" w:color="auto"/>
-          <w:insideH w:val="single" w:sz="4" w:space="0" w:color="auto"/>
-          <w:insideV w:val="single" w:sz="4" w:space="0" w:color="auto"/>
-        </w:tblBorders>
-        <w:tblLook w:val="00A0" w:firstRow="1" w:lastRow="0" w:firstColumn="1" w:lastColumn="0" w:noHBand="0" w:noVBand="0"/>
-      </w:tblPr>
-      <w:tblGrid>
-        <w:gridCol w:w="9628"/>
-      </w:tblGrid>
-      <w:tr>
-        <w:tc>
-          <w:tcPr>
-            <w:tcW w:w="9628" w:type="dxa"/>
-            <w:shd w:val="clear" w:color="auto" w:fill="auto"/>
-          </w:tcPr>
-          <w:p>
-            <w:pPr>
-              <w:rPr>
-                <w:lang w:val="it-IT"/>
-              </w:rPr>
-            </w:pPr>
-            <w:r>
-              <w:rPr>
-                <w:noProof/>
-                <w:lang w:val="it-IT"/>
-              </w:rPr>
-              <w:drawing>
-                <wp:inline distT="0" distB="0" distL="0" distR="0" wp14:anchorId="3C988473" wp14:editId="421E0D4A">
-                  <wp:extent cx="5972175" cy="2876550"/>
-                  <wp:effectExtent l="0" t="0" r="0" b="0"/>
-                  <wp:docPr id="1" name="Immagine 1"/>
-                  <wp:cNvGraphicFramePr>
-                    <a:graphicFrameLocks xmlns:a="http://schemas.openxmlformats.org/drawingml/2006/main" noChangeAspect="1"/>
-                  </wp:cNvGraphicFramePr>
-                  <a:graphic xmlns:a="http://schemas.openxmlformats.org/drawingml/2006/main">
-                    <a:graphicData uri="http://schemas.openxmlformats.org/drawingml/2006/picture">
-                      <pic:pic xmlns:pic="http://schemas.openxmlformats.org/drawingml/2006/picture">
-                        <pic:nvPicPr>
-                          <pic:cNvPr id="0" name="Picture 1"/>
-                          <pic:cNvPicPr>
-                            <a:picLocks noChangeAspect="1" noChangeArrowheads="1"/>
-                          </pic:cNvPicPr>
-                        </pic:nvPicPr>
-                        <pic:blipFill>
-                          <a:blip r:embed="rId8">
-                            <a:extLst>
-                              <a:ext uri="{28A0092B-C50C-407E-A947-70E740481C1C}">
-                                <a14:useLocalDpi xmlns:a14="http://schemas.microsoft.com/office/drawing/2010/main" val="0"/>
-                              </a:ext>
-                            </a:extLst>
-                          </a:blip>
-                          <a:srcRect r="6310"/>
-                          <a:stretch>
-                            <a:fillRect/>
-                          </a:stretch>
-                        </pic:blipFill>
-                        <pic:spPr bwMode="auto">
-                          <a:xfrm>
-                            <a:off x="0" y="0"/>
-                            <a:ext cx="5972175" cy="2876550"/>
-                          </a:xfrm>
-                          <a:prstGeom prst="rect">
-                            <a:avLst/>
-                          </a:prstGeom>
-                          <a:noFill/>
-                          <a:ln>
-                            <a:noFill/>
-                          </a:ln>
-                        </pic:spPr>
-                      </pic:pic>
-                    </a:graphicData>
-                  </a:graphic>
-                </wp:inline>
-              </w:drawing>
-            </w:r>
-          </w:p>
-          <w:p>
-            <w:pPr>
-              <w:pStyle w:val="Didascalia"/>
-              <w:rPr>
-                <w:lang w:val="it-IT"/>
-              </w:rPr>
-            </w:pPr>
-            <w:r>
-              <w:t xml:space="preserve">Figura </w:t>
-            </w:r>
-            <w:r>
-              <w:fldChar w:fldCharType="begin"/>
-            </w:r>
-            <w:r>
-              <w:instrText xml:space="preserve"> SEQ Figura \* ARABIC </w:instrText>
-            </w:r>
-            <w:r>
-              <w:fldChar w:fldCharType="separate"/>
-            </w:r>
-            <w:r>
-              <w:rPr>
-                <w:noProof/>
-              </w:rPr>
-              <w:t>1</w:t>
-            </w:r>
-            <w:r>
-              <w:rPr>
-                <w:noProof/>
-              </w:rPr>
-              <w:fldChar w:fldCharType="end"/>
-            </w:r>
-            <w:r>
-              <w:t>: Esempio di diagramma di Gantt.</w:t>
-            </w:r>
-          </w:p>
-        </w:tc>
-      </w:tr>
-    </w:tbl>
-    <w:p>
-      <w:pPr>
-        <w:rPr>
-          <w:lang w:val="it-IT"/>
-        </w:rPr>
-      </w:pPr>
+    <w:p>
+      <w:pPr>
+        <w:keepNext/>
+      </w:pPr>
+      <w:r>
+        <w:rPr>
+          <w:lang w:val="it-IT"/>
+        </w:rPr>
+        <w:drawing>
+          <wp:inline distT="0" distB="0" distL="0" distR="0" wp14:anchorId="4E24B39E" wp14:editId="32349BA4">
+            <wp:extent cx="6120130" cy="2858770"/>
+            <wp:effectExtent l="0" t="0" r="0" b="0"/>
+            <wp:docPr id="1" name="Immagine 1"/>
+            <wp:cNvGraphicFramePr>
+              <a:graphicFrameLocks xmlns:a="http://schemas.openxmlformats.org/drawingml/2006/main" noChangeAspect="1"/>
+            </wp:cNvGraphicFramePr>
+            <a:graphic xmlns:a="http://schemas.openxmlformats.org/drawingml/2006/main">
+              <a:graphicData uri="http://schemas.openxmlformats.org/drawingml/2006/picture">
+                <pic:pic xmlns:pic="http://schemas.openxmlformats.org/drawingml/2006/picture">
+                  <pic:nvPicPr>
+                    <pic:cNvPr id="1" name=""/>
+                    <pic:cNvPicPr/>
+                  </pic:nvPicPr>
+                  <pic:blipFill>
+                    <a:blip r:embed="rId9"/>
+                    <a:stretch>
+                      <a:fillRect/>
+                    </a:stretch>
+                  </pic:blipFill>
+                  <pic:spPr>
+                    <a:xfrm>
+                      <a:off x="0" y="0"/>
+                      <a:ext cx="6120130" cy="2858770"/>
+                    </a:xfrm>
+                    <a:prstGeom prst="rect">
+                      <a:avLst/>
+                    </a:prstGeom>
+                  </pic:spPr>
+                </pic:pic>
+              </a:graphicData>
+            </a:graphic>
+          </wp:inline>
+        </w:drawing>
+      </w:r>
+    </w:p>
+    <w:p>
+      <w:pPr>
+        <w:pStyle w:val="Didascalia"/>
+        <w:rPr>
+          <w:lang w:val="it-IT"/>
+        </w:rPr>
+      </w:pPr>
+      <w:r>
+        <w:t xml:space="preserve">Figura </w:t>
+      </w:r>
+      <w:r>
+        <w:fldChar w:fldCharType="begin"/>
+      </w:r>
+      <w:r>
+        <w:instrText xml:space="preserve"> SEQ Figura \* ARABIC </w:instrText>
+      </w:r>
+      <w:r>
+        <w:fldChar w:fldCharType="separate"/>
+      </w:r>
+      <w:r>
+        <w:rPr>
+          <w:noProof/>
+        </w:rPr>
+        <w:t>2</w:t>
+      </w:r>
+      <w:r>
+        <w:fldChar w:fldCharType="end"/>
+      </w:r>
+      <w:r>
+        <w:t>: Gantt Preventivo</w:t>
+      </w:r>
     </w:p>
     <w:p>
       <w:pPr>
@@ -10762,13 +10782,7 @@
               <w:rPr>
                 <w:lang w:val="fr-CH"/>
               </w:rPr>
-              <w:t>,</w:t>
-            </w:r>
-            <w:r>
-              <w:rPr>
-                <w:lang w:val="fr-CH"/>
-              </w:rPr>
-              <w:t xml:space="preserve"> C#, C++</w:t>
+              <w:t>, C#, C++</w:t>
             </w:r>
           </w:p>
         </w:tc>
@@ -11477,26 +11491,6 @@
     </w:p>
     <w:p>
       <w:pPr>
-        <w:rPr>
-          <w:lang w:val="it-IT"/>
-        </w:rPr>
-      </w:pPr>
-      <w:r>
-        <w:rPr>
-          <w:lang w:val="it-IT"/>
-        </w:rPr>
-        <w:t>Questo capitolo descrive esaustivamente come deve essere realizzato il prodotto fin nei suoi dettagli. Una buona progettazione permette all’esecutore di evitare fraintendimenti e imprecisioni nell’implementazione del prodotto.</w:t>
-      </w:r>
-    </w:p>
-    <w:p>
-      <w:pPr>
-        <w:rPr>
-          <w:lang w:val="it-IT"/>
-        </w:rPr>
-      </w:pPr>
-    </w:p>
-    <w:p>
-      <w:pPr>
         <w:pStyle w:val="Titolo2"/>
       </w:pPr>
       <w:bookmarkStart w:id="17" w:name="_Toc429059809"/>
@@ -11650,260 +11644,669 @@
       <w:pPr>
         <w:pStyle w:val="Titolo2"/>
       </w:pPr>
-      <w:bookmarkStart w:id="19" w:name="_Toc429059810"/>
-      <w:bookmarkStart w:id="20" w:name="_Toc94790456"/>
-      <w:r>
-        <w:t>Design dei dati</w:t>
-      </w:r>
-      <w:r>
-        <w:t xml:space="preserve"> e database</w:t>
+      <w:bookmarkStart w:id="19" w:name="_Toc429059811"/>
+      <w:bookmarkStart w:id="20" w:name="_Toc94790457"/>
+      <w:r>
+        <w:rPr>
+          <w:noProof/>
+        </w:rPr>
+        <mc:AlternateContent>
+          <mc:Choice Requires="wps">
+            <w:drawing>
+              <wp:anchor distT="0" distB="0" distL="114300" distR="114300" simplePos="0" relativeHeight="251660288" behindDoc="0" locked="0" layoutInCell="1" allowOverlap="1" wp14:anchorId="4E47AD67" wp14:editId="54FA28BE">
+                <wp:simplePos x="0" y="0"/>
+                <wp:positionH relativeFrom="margin">
+                  <wp:align>center</wp:align>
+                </wp:positionH>
+                <wp:positionV relativeFrom="paragraph">
+                  <wp:posOffset>2978785</wp:posOffset>
+                </wp:positionV>
+                <wp:extent cx="2924175" cy="635"/>
+                <wp:effectExtent l="0" t="0" r="9525" b="0"/>
+                <wp:wrapTopAndBottom/>
+                <wp:docPr id="7" name="Casella di testo 7"/>
+                <wp:cNvGraphicFramePr/>
+                <a:graphic xmlns:a="http://schemas.openxmlformats.org/drawingml/2006/main">
+                  <a:graphicData uri="http://schemas.microsoft.com/office/word/2010/wordprocessingShape">
+                    <wps:wsp>
+                      <wps:cNvSpPr txBox="1"/>
+                      <wps:spPr>
+                        <a:xfrm>
+                          <a:off x="0" y="0"/>
+                          <a:ext cx="2924175" cy="635"/>
+                        </a:xfrm>
+                        <a:prstGeom prst="rect">
+                          <a:avLst/>
+                        </a:prstGeom>
+                        <a:solidFill>
+                          <a:prstClr val="white"/>
+                        </a:solidFill>
+                        <a:ln>
+                          <a:noFill/>
+                        </a:ln>
+                      </wps:spPr>
+                      <wps:txbx>
+                        <w:txbxContent>
+                          <w:p>
+                            <w:pPr>
+                              <w:pStyle w:val="Didascalia"/>
+                              <w:rPr>
+                                <w:b/>
+                                <w:noProof/>
+                                <w:sz w:val="20"/>
+                                <w:lang w:val="it-IT"/>
+                              </w:rPr>
+                            </w:pPr>
+                            <w:r>
+                              <w:t xml:space="preserve">Figura </w:t>
+                            </w:r>
+                            <w:r>
+                              <w:fldChar w:fldCharType="begin"/>
+                            </w:r>
+                            <w:r>
+                              <w:instrText xml:space="preserve"> SEQ Figura \* ARABIC </w:instrText>
+                            </w:r>
+                            <w:r>
+                              <w:fldChar w:fldCharType="separate"/>
+                            </w:r>
+                            <w:r>
+                              <w:rPr>
+                                <w:noProof/>
+                              </w:rPr>
+                              <w:t>3</w:t>
+                            </w:r>
+                            <w:r>
+                              <w:fldChar w:fldCharType="end"/>
+                            </w:r>
+                            <w:r>
+                              <w:t xml:space="preserve">: Sprite Player in forma </w:t>
+                            </w:r>
+                            <w:proofErr w:type="spellStart"/>
+                            <w:r>
+                              <w:t>Flesh</w:t>
+                            </w:r>
+                            <w:proofErr w:type="spellEnd"/>
+                          </w:p>
+                        </w:txbxContent>
+                      </wps:txbx>
+                      <wps:bodyPr rot="0" spcFirstLastPara="0" vertOverflow="overflow" horzOverflow="overflow" vert="horz" wrap="square" lIns="0" tIns="0" rIns="0" bIns="0" numCol="1" spcCol="0" rtlCol="0" fromWordArt="0" anchor="t" anchorCtr="0" forceAA="0" compatLnSpc="1">
+                        <a:prstTxWarp prst="textNoShape">
+                          <a:avLst/>
+                        </a:prstTxWarp>
+                        <a:spAutoFit/>
+                      </wps:bodyPr>
+                    </wps:wsp>
+                  </a:graphicData>
+                </a:graphic>
+              </wp:anchor>
+            </w:drawing>
+          </mc:Choice>
+          <mc:Fallback>
+            <w:pict>
+              <v:shapetype w14:anchorId="4E47AD67" id="_x0000_t202" coordsize="21600,21600" o:spt="202" path="m,l,21600r21600,l21600,xe">
+                <v:stroke joinstyle="miter"/>
+                <v:path gradientshapeok="t" o:connecttype="rect"/>
+              </v:shapetype>
+              <v:shape id="Casella di testo 7" o:spid="_x0000_s1026" type="#_x0000_t202" style="position:absolute;left:0;text-align:left;margin-left:0;margin-top:234.55pt;width:230.25pt;height:.05pt;z-index:251660288;visibility:visible;mso-wrap-style:square;mso-wrap-distance-left:9pt;mso-wrap-distance-top:0;mso-wrap-distance-right:9pt;mso-wrap-distance-bottom:0;mso-position-horizontal:center;mso-position-horizontal-relative:margin;mso-position-vertical:absolute;mso-position-vertical-relative:text;v-text-anchor:top" o:gfxdata="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" stroked="f">
+                <v:textbox style="mso-fit-shape-to-text:t" inset="0,0,0,0">
+                  <w:txbxContent>
+                    <w:p>
+                      <w:pPr>
+                        <w:pStyle w:val="Didascalia"/>
+                        <w:rPr>
+                          <w:b/>
+                          <w:noProof/>
+                          <w:sz w:val="20"/>
+                          <w:lang w:val="it-IT"/>
+                        </w:rPr>
+                      </w:pPr>
+                      <w:r>
+                        <w:t xml:space="preserve">Figura </w:t>
+                      </w:r>
+                      <w:r>
+                        <w:fldChar w:fldCharType="begin"/>
+                      </w:r>
+                      <w:r>
+                        <w:instrText xml:space="preserve"> SEQ Figura \* ARABIC </w:instrText>
+                      </w:r>
+                      <w:r>
+                        <w:fldChar w:fldCharType="separate"/>
+                      </w:r>
+                      <w:r>
+                        <w:rPr>
+                          <w:noProof/>
+                        </w:rPr>
+                        <w:t>3</w:t>
+                      </w:r>
+                      <w:r>
+                        <w:fldChar w:fldCharType="end"/>
+                      </w:r>
+                      <w:r>
+                        <w:t xml:space="preserve">: Sprite Player in forma </w:t>
+                      </w:r>
+                      <w:proofErr w:type="spellStart"/>
+                      <w:r>
+                        <w:t>Flesh</w:t>
+                      </w:r>
+                      <w:proofErr w:type="spellEnd"/>
+                    </w:p>
+                  </w:txbxContent>
+                </v:textbox>
+                <w10:wrap type="topAndBottom" anchorx="margin"/>
+              </v:shape>
+            </w:pict>
+          </mc:Fallback>
+        </mc:AlternateContent>
+      </w:r>
+      <w:r>
+        <w:t>Design delle interfacce</w:t>
       </w:r>
       <w:bookmarkEnd w:id="19"/>
       <w:bookmarkEnd w:id="20"/>
-    </w:p>
-    <w:p>
-      <w:pPr>
-        <w:rPr>
-          <w:lang w:val="it-IT"/>
-        </w:rPr>
-      </w:pPr>
-      <w:r>
-        <w:rPr>
-          <w:lang w:val="it-IT"/>
-        </w:rPr>
-        <w:t xml:space="preserve">Descrizione delle strutture di dati utilizzate dal programma in base agli attributi e le </w:t>
-      </w:r>
-      <w:r>
-        <w:rPr>
-          <w:lang w:val="it-IT"/>
-        </w:rPr>
-        <w:t>relazioni degli oggetti in uso.</w:t>
-      </w:r>
-    </w:p>
-    <w:p>
-      <w:pPr>
-        <w:rPr>
-          <w:lang w:val="it-IT"/>
-        </w:rPr>
-      </w:pPr>
-      <w:r>
-        <w:rPr>
-          <w:lang w:val="it-IT"/>
-        </w:rPr>
-        <w:t>Schema E-R, schema logico e descrizione.</w:t>
-      </w:r>
-    </w:p>
-    <w:p>
-      <w:pPr>
-        <w:rPr>
-          <w:lang w:val="it-IT"/>
-        </w:rPr>
-      </w:pPr>
-      <w:r>
-        <w:rPr>
-          <w:lang w:val="it-IT"/>
-        </w:rPr>
-        <w:t>Se il diagramma E-R viene modificato, sulla doc dovrà apparire l’ultima versione, mentre le vecchie saranno sui diari.</w:t>
+      <w:r>
+        <w:rPr>
+          <w:noProof/>
+        </w:rPr>
+        <w:drawing>
+          <wp:anchor distT="0" distB="0" distL="114300" distR="114300" simplePos="0" relativeHeight="251658240" behindDoc="1" locked="0" layoutInCell="1" allowOverlap="1" wp14:anchorId="3CA59870" wp14:editId="6E18F270">
+            <wp:simplePos x="0" y="0"/>
+            <wp:positionH relativeFrom="margin">
+              <wp:align>center</wp:align>
+            </wp:positionH>
+            <wp:positionV relativeFrom="paragraph">
+              <wp:posOffset>356235</wp:posOffset>
+            </wp:positionV>
+            <wp:extent cx="2533650" cy="2533650"/>
+            <wp:effectExtent l="0" t="0" r="0" b="0"/>
+            <wp:wrapTopAndBottom/>
+            <wp:docPr id="6" name="Immagine 6"/>
+            <wp:cNvGraphicFramePr>
+              <a:graphicFrameLocks xmlns:a="http://schemas.openxmlformats.org/drawingml/2006/main" noChangeAspect="1"/>
+            </wp:cNvGraphicFramePr>
+            <a:graphic xmlns:a="http://schemas.openxmlformats.org/drawingml/2006/main">
+              <a:graphicData uri="http://schemas.openxmlformats.org/drawingml/2006/picture">
+                <pic:pic xmlns:pic="http://schemas.openxmlformats.org/drawingml/2006/picture">
+                  <pic:nvPicPr>
+                    <pic:cNvPr id="0" name="Picture 3"/>
+                    <pic:cNvPicPr>
+                      <a:picLocks noChangeAspect="1" noChangeArrowheads="1"/>
+                    </pic:cNvPicPr>
+                  </pic:nvPicPr>
+                  <pic:blipFill>
+                    <a:blip r:embed="rId10">
+                      <a:extLst>
+                        <a:ext uri="{28A0092B-C50C-407E-A947-70E740481C1C}">
+                          <a14:useLocalDpi xmlns:a14="http://schemas.microsoft.com/office/drawing/2010/main" val="0"/>
+                        </a:ext>
+                      </a:extLst>
+                    </a:blip>
+                    <a:srcRect/>
+                    <a:stretch>
+                      <a:fillRect/>
+                    </a:stretch>
+                  </pic:blipFill>
+                  <pic:spPr bwMode="auto">
+                    <a:xfrm>
+                      <a:off x="0" y="0"/>
+                      <a:ext cx="2533650" cy="2533650"/>
+                    </a:xfrm>
+                    <a:prstGeom prst="rect">
+                      <a:avLst/>
+                    </a:prstGeom>
+                    <a:noFill/>
+                    <a:ln>
+                      <a:noFill/>
+                    </a:ln>
+                  </pic:spPr>
+                </pic:pic>
+              </a:graphicData>
+            </a:graphic>
+            <wp14:sizeRelH relativeFrom="margin">
+              <wp14:pctWidth>0</wp14:pctWidth>
+            </wp14:sizeRelH>
+            <wp14:sizeRelV relativeFrom="margin">
+              <wp14:pctHeight>0</wp14:pctHeight>
+            </wp14:sizeRelV>
+          </wp:anchor>
+        </w:drawing>
+      </w:r>
+    </w:p>
+    <w:p>
+      <w:pPr>
+        <w:pStyle w:val="NormaleWeb"/>
+      </w:pPr>
+    </w:p>
+    <w:p>
+      <w:pPr>
+        <w:pStyle w:val="NormaleWeb"/>
+      </w:pPr>
+    </w:p>
+    <w:p>
+      <w:pPr>
+        <w:pStyle w:val="NormaleWeb"/>
+      </w:pPr>
+      <w:r>
+        <w:rPr>
+          <w:noProof/>
+        </w:rPr>
+        <w:lastRenderedPageBreak/>
+        <mc:AlternateContent>
+          <mc:Choice Requires="wps">
+            <w:drawing>
+              <wp:anchor distT="0" distB="0" distL="114300" distR="114300" simplePos="0" relativeHeight="251663360" behindDoc="0" locked="0" layoutInCell="1" allowOverlap="1" wp14:anchorId="4809F76C" wp14:editId="5C79E1CC">
+                <wp:simplePos x="0" y="0"/>
+                <wp:positionH relativeFrom="column">
+                  <wp:posOffset>321310</wp:posOffset>
+                </wp:positionH>
+                <wp:positionV relativeFrom="paragraph">
+                  <wp:posOffset>3137535</wp:posOffset>
+                </wp:positionV>
+                <wp:extent cx="5476875" cy="635"/>
+                <wp:effectExtent l="0" t="0" r="0" b="0"/>
+                <wp:wrapTopAndBottom/>
+                <wp:docPr id="11" name="Casella di testo 11"/>
+                <wp:cNvGraphicFramePr/>
+                <a:graphic xmlns:a="http://schemas.openxmlformats.org/drawingml/2006/main">
+                  <a:graphicData uri="http://schemas.microsoft.com/office/word/2010/wordprocessingShape">
+                    <wps:wsp>
+                      <wps:cNvSpPr txBox="1"/>
+                      <wps:spPr>
+                        <a:xfrm>
+                          <a:off x="0" y="0"/>
+                          <a:ext cx="5476875" cy="635"/>
+                        </a:xfrm>
+                        <a:prstGeom prst="rect">
+                          <a:avLst/>
+                        </a:prstGeom>
+                        <a:solidFill>
+                          <a:prstClr val="white"/>
+                        </a:solidFill>
+                        <a:ln>
+                          <a:noFill/>
+                        </a:ln>
+                      </wps:spPr>
+                      <wps:txbx>
+                        <w:txbxContent>
+                          <w:p>
+                            <w:pPr>
+                              <w:pStyle w:val="Didascalia"/>
+                              <w:rPr>
+                                <w:rFonts w:ascii="Times New Roman" w:hAnsi="Times New Roman"/>
+                              </w:rPr>
+                            </w:pPr>
+                            <w:r>
+                              <w:t xml:space="preserve">Figura </w:t>
+                            </w:r>
+                            <w:r>
+                              <w:fldChar w:fldCharType="begin"/>
+                            </w:r>
+                            <w:r>
+                              <w:instrText xml:space="preserve"> SEQ Figura \* ARABIC </w:instrText>
+                            </w:r>
+                            <w:r>
+                              <w:fldChar w:fldCharType="separate"/>
+                            </w:r>
+                            <w:r>
+                              <w:rPr>
+                                <w:noProof/>
+                              </w:rPr>
+                              <w:t>4</w:t>
+                            </w:r>
+                            <w:r>
+                              <w:fldChar w:fldCharType="end"/>
+                            </w:r>
+                            <w:r>
+                              <w:t>: Sprite stanza iniziale</w:t>
+                            </w:r>
+                          </w:p>
+                        </w:txbxContent>
+                      </wps:txbx>
+                      <wps:bodyPr rot="0" spcFirstLastPara="0" vertOverflow="overflow" horzOverflow="overflow" vert="horz" wrap="square" lIns="0" tIns="0" rIns="0" bIns="0" numCol="1" spcCol="0" rtlCol="0" fromWordArt="0" anchor="t" anchorCtr="0" forceAA="0" compatLnSpc="1">
+                        <a:prstTxWarp prst="textNoShape">
+                          <a:avLst/>
+                        </a:prstTxWarp>
+                        <a:spAutoFit/>
+                      </wps:bodyPr>
+                    </wps:wsp>
+                  </a:graphicData>
+                </a:graphic>
+              </wp:anchor>
+            </w:drawing>
+          </mc:Choice>
+          <mc:Fallback>
+            <w:pict>
+              <v:shape w14:anchorId="4809F76C" id="Casella di testo 11" o:spid="_x0000_s1027" type="#_x0000_t202" style="position:absolute;margin-left:25.3pt;margin-top:247.05pt;width:431.25pt;height:.05pt;z-index:251663360;visibility:visible;mso-wrap-style:square;mso-wrap-distance-left:9pt;mso-wrap-distance-top:0;mso-wrap-distance-right:9pt;mso-wrap-distance-bottom:0;mso-position-horizontal:absolute;mso-position-horizontal-relative:text;mso-position-vertical:absolute;mso-position-vertical-relative:text;v-text-anchor:top" o:gfxdata="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" stroked="f">
+                <v:textbox style="mso-fit-shape-to-text:t" inset="0,0,0,0">
+                  <w:txbxContent>
+                    <w:p>
+                      <w:pPr>
+                        <w:pStyle w:val="Didascalia"/>
+                        <w:rPr>
+                          <w:rFonts w:ascii="Times New Roman" w:hAnsi="Times New Roman"/>
+                        </w:rPr>
+                      </w:pPr>
+                      <w:r>
+                        <w:t xml:space="preserve">Figura </w:t>
+                      </w:r>
+                      <w:r>
+                        <w:fldChar w:fldCharType="begin"/>
+                      </w:r>
+                      <w:r>
+                        <w:instrText xml:space="preserve"> SEQ Figura \* ARABIC </w:instrText>
+                      </w:r>
+                      <w:r>
+                        <w:fldChar w:fldCharType="separate"/>
+                      </w:r>
+                      <w:r>
+                        <w:rPr>
+                          <w:noProof/>
+                        </w:rPr>
+                        <w:t>4</w:t>
+                      </w:r>
+                      <w:r>
+                        <w:fldChar w:fldCharType="end"/>
+                      </w:r>
+                      <w:r>
+                        <w:t>: Sprite stanza iniziale</w:t>
+                      </w:r>
+                    </w:p>
+                  </w:txbxContent>
+                </v:textbox>
+                <w10:wrap type="topAndBottom"/>
+              </v:shape>
+            </w:pict>
+          </mc:Fallback>
+        </mc:AlternateContent>
+      </w:r>
+      <w:r>
+        <w:drawing>
+          <wp:anchor distT="0" distB="0" distL="114300" distR="114300" simplePos="0" relativeHeight="251661312" behindDoc="0" locked="0" layoutInCell="1" allowOverlap="1" wp14:anchorId="65ACE336" wp14:editId="6E3F5FB7">
+            <wp:simplePos x="0" y="0"/>
+            <wp:positionH relativeFrom="margin">
+              <wp:align>center</wp:align>
+            </wp:positionH>
+            <wp:positionV relativeFrom="paragraph">
+              <wp:posOffset>0</wp:posOffset>
+            </wp:positionV>
+            <wp:extent cx="5476875" cy="3080742"/>
+            <wp:effectExtent l="0" t="0" r="0" b="5715"/>
+            <wp:wrapTopAndBottom/>
+            <wp:docPr id="10" name="Immagine 10"/>
+            <wp:cNvGraphicFramePr>
+              <a:graphicFrameLocks xmlns:a="http://schemas.openxmlformats.org/drawingml/2006/main" noChangeAspect="1"/>
+            </wp:cNvGraphicFramePr>
+            <a:graphic xmlns:a="http://schemas.openxmlformats.org/drawingml/2006/main">
+              <a:graphicData uri="http://schemas.openxmlformats.org/drawingml/2006/picture">
+                <pic:pic xmlns:pic="http://schemas.openxmlformats.org/drawingml/2006/picture">
+                  <pic:nvPicPr>
+                    <pic:cNvPr id="0" name="Picture 15"/>
+                    <pic:cNvPicPr>
+                      <a:picLocks noChangeAspect="1" noChangeArrowheads="1"/>
+                    </pic:cNvPicPr>
+                  </pic:nvPicPr>
+                  <pic:blipFill>
+                    <a:blip r:embed="rId11">
+                      <a:extLst>
+                        <a:ext uri="{28A0092B-C50C-407E-A947-70E740481C1C}">
+                          <a14:useLocalDpi xmlns:a14="http://schemas.microsoft.com/office/drawing/2010/main" val="0"/>
+                        </a:ext>
+                      </a:extLst>
+                    </a:blip>
+                    <a:srcRect/>
+                    <a:stretch>
+                      <a:fillRect/>
+                    </a:stretch>
+                  </pic:blipFill>
+                  <pic:spPr bwMode="auto">
+                    <a:xfrm>
+                      <a:off x="0" y="0"/>
+                      <a:ext cx="5476875" cy="3080742"/>
+                    </a:xfrm>
+                    <a:prstGeom prst="rect">
+                      <a:avLst/>
+                    </a:prstGeom>
+                    <a:noFill/>
+                    <a:ln>
+                      <a:noFill/>
+                    </a:ln>
+                  </pic:spPr>
+                </pic:pic>
+              </a:graphicData>
+            </a:graphic>
+          </wp:anchor>
+        </w:drawing>
+      </w:r>
+    </w:p>
+    <w:p>
+      <w:pPr>
+        <w:pStyle w:val="NormaleWeb"/>
+      </w:pPr>
+      <w:r>
+        <w:drawing>
+          <wp:anchor distT="0" distB="0" distL="114300" distR="114300" simplePos="0" relativeHeight="251664384" behindDoc="0" locked="0" layoutInCell="1" allowOverlap="1" wp14:anchorId="414000B4" wp14:editId="70ED0E2A">
+            <wp:simplePos x="0" y="0"/>
+            <wp:positionH relativeFrom="column">
+              <wp:posOffset>1813560</wp:posOffset>
+            </wp:positionH>
+            <wp:positionV relativeFrom="paragraph">
+              <wp:posOffset>269240</wp:posOffset>
+            </wp:positionV>
+            <wp:extent cx="2057400" cy="2244436"/>
+            <wp:effectExtent l="0" t="0" r="0" b="3810"/>
+            <wp:wrapTopAndBottom/>
+            <wp:docPr id="13" name="Immagine 13"/>
+            <wp:cNvGraphicFramePr>
+              <a:graphicFrameLocks xmlns:a="http://schemas.openxmlformats.org/drawingml/2006/main" noChangeAspect="1"/>
+            </wp:cNvGraphicFramePr>
+            <a:graphic xmlns:a="http://schemas.openxmlformats.org/drawingml/2006/main">
+              <a:graphicData uri="http://schemas.openxmlformats.org/drawingml/2006/picture">
+                <pic:pic xmlns:pic="http://schemas.openxmlformats.org/drawingml/2006/picture">
+                  <pic:nvPicPr>
+                    <pic:cNvPr id="0" name="Picture 22"/>
+                    <pic:cNvPicPr>
+                      <a:picLocks noChangeAspect="1" noChangeArrowheads="1"/>
+                    </pic:cNvPicPr>
+                  </pic:nvPicPr>
+                  <pic:blipFill>
+                    <a:blip r:embed="rId12">
+                      <a:extLst>
+                        <a:ext uri="{28A0092B-C50C-407E-A947-70E740481C1C}">
+                          <a14:useLocalDpi xmlns:a14="http://schemas.microsoft.com/office/drawing/2010/main" val="0"/>
+                        </a:ext>
+                      </a:extLst>
+                    </a:blip>
+                    <a:srcRect/>
+                    <a:stretch>
+                      <a:fillRect/>
+                    </a:stretch>
+                  </pic:blipFill>
+                  <pic:spPr bwMode="auto">
+                    <a:xfrm>
+                      <a:off x="0" y="0"/>
+                      <a:ext cx="2057400" cy="2244436"/>
+                    </a:xfrm>
+                    <a:prstGeom prst="rect">
+                      <a:avLst/>
+                    </a:prstGeom>
+                    <a:noFill/>
+                    <a:ln>
+                      <a:noFill/>
+                    </a:ln>
+                  </pic:spPr>
+                </pic:pic>
+              </a:graphicData>
+            </a:graphic>
+          </wp:anchor>
+        </w:drawing>
+      </w:r>
+    </w:p>
+    <w:p>
+      <w:pPr>
+        <w:pStyle w:val="NormaleWeb"/>
+      </w:pPr>
+      <w:r>
+        <w:rPr>
+          <w:noProof/>
+        </w:rPr>
+        <mc:AlternateContent>
+          <mc:Choice Requires="wps">
+            <w:drawing>
+              <wp:anchor distT="0" distB="0" distL="114300" distR="114300" simplePos="0" relativeHeight="251666432" behindDoc="0" locked="0" layoutInCell="1" allowOverlap="1" wp14:anchorId="53E1BA6D" wp14:editId="7A43B151">
+                <wp:simplePos x="0" y="0"/>
+                <wp:positionH relativeFrom="column">
+                  <wp:posOffset>1832610</wp:posOffset>
+                </wp:positionH>
+                <wp:positionV relativeFrom="paragraph">
+                  <wp:posOffset>2537460</wp:posOffset>
+                </wp:positionV>
+                <wp:extent cx="2057400" cy="635"/>
+                <wp:effectExtent l="0" t="0" r="0" b="0"/>
+                <wp:wrapTopAndBottom/>
+                <wp:docPr id="14" name="Casella di testo 14"/>
+                <wp:cNvGraphicFramePr/>
+                <a:graphic xmlns:a="http://schemas.openxmlformats.org/drawingml/2006/main">
+                  <a:graphicData uri="http://schemas.microsoft.com/office/word/2010/wordprocessingShape">
+                    <wps:wsp>
+                      <wps:cNvSpPr txBox="1"/>
+                      <wps:spPr>
+                        <a:xfrm>
+                          <a:off x="0" y="0"/>
+                          <a:ext cx="2057400" cy="635"/>
+                        </a:xfrm>
+                        <a:prstGeom prst="rect">
+                          <a:avLst/>
+                        </a:prstGeom>
+                        <a:solidFill>
+                          <a:prstClr val="white"/>
+                        </a:solidFill>
+                        <a:ln>
+                          <a:noFill/>
+                        </a:ln>
+                      </wps:spPr>
+                      <wps:txbx>
+                        <w:txbxContent>
+                          <w:p>
+                            <w:pPr>
+                              <w:pStyle w:val="Didascalia"/>
+                              <w:rPr>
+                                <w:rFonts w:ascii="Times New Roman" w:hAnsi="Times New Roman"/>
+                              </w:rPr>
+                            </w:pPr>
+                            <w:r>
+                              <w:t xml:space="preserve">Figura </w:t>
+                            </w:r>
+                            <w:r>
+                              <w:fldChar w:fldCharType="begin"/>
+                            </w:r>
+                            <w:r>
+                              <w:instrText xml:space="preserve"> SEQ Figura \* ARABIC </w:instrText>
+                            </w:r>
+                            <w:r>
+                              <w:fldChar w:fldCharType="separate"/>
+                            </w:r>
+                            <w:r>
+                              <w:rPr>
+                                <w:noProof/>
+                              </w:rPr>
+                              <w:t>5</w:t>
+                            </w:r>
+                            <w:r>
+                              <w:fldChar w:fldCharType="end"/>
+                            </w:r>
+                            <w:r>
+                              <w:t>: Esempio nemico base</w:t>
+                            </w:r>
+                          </w:p>
+                        </w:txbxContent>
+                      </wps:txbx>
+                      <wps:bodyPr rot="0" spcFirstLastPara="0" vertOverflow="overflow" horzOverflow="overflow" vert="horz" wrap="square" lIns="0" tIns="0" rIns="0" bIns="0" numCol="1" spcCol="0" rtlCol="0" fromWordArt="0" anchor="t" anchorCtr="0" forceAA="0" compatLnSpc="1">
+                        <a:prstTxWarp prst="textNoShape">
+                          <a:avLst/>
+                        </a:prstTxWarp>
+                        <a:spAutoFit/>
+                      </wps:bodyPr>
+                    </wps:wsp>
+                  </a:graphicData>
+                </a:graphic>
+              </wp:anchor>
+            </w:drawing>
+          </mc:Choice>
+          <mc:Fallback>
+            <w:pict>
+              <v:shape w14:anchorId="53E1BA6D" id="Casella di testo 14" o:spid="_x0000_s1028" type="#_x0000_t202" style="position:absolute;margin-left:144.3pt;margin-top:199.8pt;width:162pt;height:.05pt;z-index:251666432;visibility:visible;mso-wrap-style:square;mso-wrap-distance-left:9pt;mso-wrap-distance-top:0;mso-wrap-distance-right:9pt;mso-wrap-distance-bottom:0;mso-position-horizontal:absolute;mso-position-horizontal-relative:text;mso-position-vertical:absolute;mso-position-vertical-relative:text;v-text-anchor:top" o:gfxdata="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" stroked="f">
+                <v:textbox style="mso-fit-shape-to-text:t" inset="0,0,0,0">
+                  <w:txbxContent>
+                    <w:p>
+                      <w:pPr>
+                        <w:pStyle w:val="Didascalia"/>
+                        <w:rPr>
+                          <w:rFonts w:ascii="Times New Roman" w:hAnsi="Times New Roman"/>
+                        </w:rPr>
+                      </w:pPr>
+                      <w:r>
+                        <w:t xml:space="preserve">Figura </w:t>
+                      </w:r>
+                      <w:r>
+                        <w:fldChar w:fldCharType="begin"/>
+                      </w:r>
+                      <w:r>
+                        <w:instrText xml:space="preserve"> SEQ Figura \* ARABIC </w:instrText>
+                      </w:r>
+                      <w:r>
+                        <w:fldChar w:fldCharType="separate"/>
+                      </w:r>
+                      <w:r>
+                        <w:rPr>
+                          <w:noProof/>
+                        </w:rPr>
+                        <w:t>5</w:t>
+                      </w:r>
+                      <w:r>
+                        <w:fldChar w:fldCharType="end"/>
+                      </w:r>
+                      <w:r>
+                        <w:t>: Esempio nemico base</w:t>
+                      </w:r>
+                    </w:p>
+                  </w:txbxContent>
+                </v:textbox>
+                <w10:wrap type="topAndBottom"/>
+              </v:shape>
+            </w:pict>
+          </mc:Fallback>
+        </mc:AlternateContent>
+      </w:r>
+    </w:p>
+    <w:p>
+      <w:pPr>
+        <w:rPr>
+          <w:lang w:val="it-IT"/>
+        </w:rPr>
+      </w:pPr>
+      <w:r>
+        <w:rPr>
+          <w:lang w:val="it-IT"/>
+        </w:rPr>
+        <w:br w:type="page"/>
       </w:r>
     </w:p>
     <w:p>
       <w:pPr>
         <w:pStyle w:val="Titolo2"/>
       </w:pPr>
-      <w:bookmarkStart w:id="21" w:name="_Toc429059811"/>
-      <w:bookmarkStart w:id="22" w:name="_Toc94790457"/>
-      <w:r>
-        <w:t>Design delle interfacce</w:t>
+      <w:bookmarkStart w:id="21" w:name="_Toc429059812"/>
+      <w:bookmarkStart w:id="22" w:name="_Toc94790458"/>
+      <w:r>
+        <w:lastRenderedPageBreak/>
+        <w:t>Design procedurale</w:t>
       </w:r>
       <w:bookmarkEnd w:id="21"/>
       <w:bookmarkEnd w:id="22"/>
     </w:p>
     <w:p>
       <w:pPr>
-        <w:rPr>
-          <w:lang w:val="it-IT"/>
-        </w:rPr>
-      </w:pPr>
-      <w:r>
-        <w:rPr>
-          <w:lang w:val="it-IT"/>
-        </w:rPr>
-        <w:t>Descrizione delle interfacce interne ed esterne del sistema e dell’interfaccia utente. La progettazione delle interfacce è basata sulle informazioni rica</w:t>
-      </w:r>
-      <w:r>
-        <w:rPr>
-          <w:lang w:val="it-IT"/>
-        </w:rPr>
-        <w:t xml:space="preserve">vate durante la fase di analisi e realizzata tramite </w:t>
-      </w:r>
-      <w:proofErr w:type="spellStart"/>
-      <w:r>
-        <w:rPr>
-          <w:lang w:val="it-IT"/>
-        </w:rPr>
-        <w:t>mockups</w:t>
-      </w:r>
-      <w:proofErr w:type="spellEnd"/>
-      <w:r>
-        <w:rPr>
-          <w:lang w:val="it-IT"/>
-        </w:rPr>
-        <w:t>.</w:t>
-      </w:r>
-    </w:p>
-    <w:p>
-      <w:pPr>
-        <w:pStyle w:val="Titolo2"/>
-      </w:pPr>
-      <w:bookmarkStart w:id="23" w:name="_Toc429059812"/>
-      <w:bookmarkStart w:id="24" w:name="_Toc94790458"/>
-      <w:r>
-        <w:t>Design procedurale</w:t>
-      </w:r>
-      <w:bookmarkEnd w:id="23"/>
-      <w:bookmarkEnd w:id="24"/>
-    </w:p>
-    <w:p>
-      <w:pPr>
-        <w:rPr>
-          <w:lang w:val="it-IT"/>
-        </w:rPr>
-      </w:pPr>
-      <w:r>
-        <w:rPr>
-          <w:lang w:val="it-IT"/>
-        </w:rPr>
-        <w:t xml:space="preserve">Descrive i concetti </w:t>
-      </w:r>
-      <w:r>
-        <w:rPr>
-          <w:lang w:val="it-IT"/>
-        </w:rPr>
-        <w:t>dettagliati dell’architettura/sviluppo</w:t>
-      </w:r>
-      <w:r>
-        <w:rPr>
-          <w:lang w:val="it-IT"/>
-        </w:rPr>
-        <w:t xml:space="preserve"> utilizzando ad esempio:</w:t>
-      </w:r>
-    </w:p>
-    <w:p>
-      <w:pPr>
-        <w:numPr>
-          <w:ilvl w:val="0"/>
-          <w:numId w:val="11"/>
-        </w:numPr>
-        <w:rPr>
-          <w:lang w:val="it-IT"/>
-        </w:rPr>
-      </w:pPr>
-      <w:r>
-        <w:rPr>
-          <w:lang w:val="it-IT"/>
-        </w:rPr>
-        <w:t>Diagrammi di flusso e Nassi.</w:t>
-      </w:r>
-    </w:p>
-    <w:p>
-      <w:pPr>
-        <w:numPr>
-          <w:ilvl w:val="0"/>
-          <w:numId w:val="11"/>
-        </w:numPr>
-        <w:rPr>
-          <w:lang w:val="it-IT"/>
-        </w:rPr>
-      </w:pPr>
-      <w:r>
-        <w:rPr>
-          <w:lang w:val="it-IT"/>
-        </w:rPr>
-        <w:t>Tabelle.</w:t>
-      </w:r>
-    </w:p>
-    <w:p>
-      <w:pPr>
-        <w:numPr>
-          <w:ilvl w:val="0"/>
-          <w:numId w:val="11"/>
-        </w:numPr>
-        <w:rPr>
-          <w:lang w:val="it-IT"/>
-        </w:rPr>
-      </w:pPr>
-      <w:r>
-        <w:rPr>
-          <w:lang w:val="it-IT"/>
-        </w:rPr>
-        <w:t>Classi e metodi.</w:t>
-      </w:r>
-    </w:p>
-    <w:p>
-      <w:pPr>
-        <w:numPr>
-          <w:ilvl w:val="0"/>
-          <w:numId w:val="11"/>
-        </w:numPr>
-        <w:rPr>
-          <w:lang w:val="it-IT"/>
-        </w:rPr>
-      </w:pPr>
-      <w:r>
-        <w:rPr>
-          <w:lang w:val="it-IT"/>
-        </w:rPr>
-        <w:t>Tabelle di routing</w:t>
-      </w:r>
-    </w:p>
-    <w:p>
-      <w:pPr>
-        <w:numPr>
-          <w:ilvl w:val="0"/>
-          <w:numId w:val="11"/>
-        </w:numPr>
-        <w:rPr>
-          <w:lang w:val="it-IT"/>
-        </w:rPr>
-      </w:pPr>
-      <w:r>
-        <w:rPr>
-          <w:lang w:val="it-IT"/>
-        </w:rPr>
-        <w:t>Diritti di accesso a condivisioni …</w:t>
-      </w:r>
-    </w:p>
-    <w:p>
-      <w:pPr>
-        <w:rPr>
-          <w:lang w:val="it-IT"/>
-        </w:rPr>
-      </w:pPr>
-    </w:p>
-    <w:p>
-      <w:pPr>
-        <w:rPr>
-          <w:lang w:val="it-IT"/>
-        </w:rPr>
-      </w:pPr>
-      <w:r>
-        <w:rPr>
-          <w:lang w:val="it-IT"/>
-        </w:rPr>
-        <w:t>Questi</w:t>
-      </w:r>
-      <w:r>
-        <w:rPr>
-          <w:lang w:val="it-IT"/>
-        </w:rPr>
-        <w:t xml:space="preserve"> documenti permetteranno di rappresentare i dettagli procedurali </w:t>
-      </w:r>
-      <w:r>
-        <w:rPr>
-          <w:lang w:val="it-IT"/>
-        </w:rPr>
-        <w:t>per la realizzazione del prodotto.</w:t>
-      </w:r>
+        <w:pStyle w:val="NormaleWeb"/>
+      </w:pPr>
     </w:p>
     <w:p>
       <w:pPr>
@@ -11929,98 +12332,98 @@
           <w:bottom w:val="single" w:sz="4" w:space="1" w:color="auto"/>
         </w:pBdr>
       </w:pPr>
-      <w:bookmarkStart w:id="25" w:name="_Toc461179222"/>
-      <w:bookmarkStart w:id="26" w:name="_Toc94790459"/>
+      <w:bookmarkStart w:id="23" w:name="_Toc461179222"/>
+      <w:bookmarkStart w:id="24" w:name="_Toc94790459"/>
       <w:r>
         <w:lastRenderedPageBreak/>
         <w:t>Implementazione</w:t>
       </w:r>
+      <w:bookmarkEnd w:id="23"/>
+      <w:bookmarkEnd w:id="24"/>
+    </w:p>
+    <w:p>
+      <w:r>
+        <w:t>In questo capitolo dovrà essere mostrato come è stato realizzato il lavoro. Questa parte può differenziarsi dalla progettazione in quanto il risultato ottenuto non per forza può essere come era stato progettato.</w:t>
+      </w:r>
+    </w:p>
+    <w:p>
+      <w:r>
+        <w:t xml:space="preserve">Sulla base di queste informazioni il lavoro svolto dovrà essere riproducibile. </w:t>
+      </w:r>
+    </w:p>
+    <w:p>
+      <w:r>
+        <w:t>In questa parte è richiesto l’inserimento di codice sorgente</w:t>
+      </w:r>
+      <w:r>
+        <w:t xml:space="preserve"> - </w:t>
+      </w:r>
+      <w:r>
+        <w:t>P</w:t>
+      </w:r>
+      <w:r>
+        <w:t xml:space="preserve">rint </w:t>
+      </w:r>
+      <w:r>
+        <w:t>S</w:t>
+      </w:r>
+      <w:r>
+        <w:t xml:space="preserve">creen </w:t>
+      </w:r>
+      <w:r>
+        <w:t xml:space="preserve">- </w:t>
+      </w:r>
+      <w:r>
+        <w:t>di maschere solamente per quei passaggi particolarmente significativi e/o critici.</w:t>
+      </w:r>
+    </w:p>
+    <w:p>
+      <w:r>
+        <w:t>Inoltre,</w:t>
+      </w:r>
+      <w:r>
+        <w:t xml:space="preserve"> dovranno essere descritte eventuali varianti di soluzione o scelte di prodotti con motivazione delle scelte.</w:t>
+      </w:r>
+    </w:p>
+    <w:p>
+      <w:r>
+        <w:t>Non deve apparire nessuna forma di guida d’uso di librerie o di componenti utilizzati. Eventualmente questa va allegata.</w:t>
+      </w:r>
+    </w:p>
+    <w:p>
+      <w:r>
+        <w:t>Per eventuali dettagli si possono inserire riferimenti ai diari.</w:t>
+      </w:r>
+    </w:p>
+    <w:p>
+      <w:pPr>
+        <w:pStyle w:val="Titolo1"/>
+        <w:rPr>
+          <w:lang w:val="it-IT"/>
+        </w:rPr>
+      </w:pPr>
+      <w:bookmarkStart w:id="25" w:name="_Toc461179223"/>
+      <w:bookmarkStart w:id="26" w:name="_Toc94790460"/>
+      <w:r>
+        <w:rPr>
+          <w:lang w:val="it-IT"/>
+        </w:rPr>
+        <w:t>Test</w:t>
+      </w:r>
       <w:bookmarkEnd w:id="25"/>
       <w:bookmarkEnd w:id="26"/>
     </w:p>
     <w:p>
-      <w:r>
-        <w:t>In questo capitolo dovrà essere mostrato come è stato realizzato il lavoro. Questa parte può differenziarsi dalla progettazione in quanto il risultato ottenuto non per forza può essere come era stato progettato.</w:t>
-      </w:r>
-    </w:p>
-    <w:p>
-      <w:r>
-        <w:t xml:space="preserve">Sulla base di queste informazioni il lavoro svolto dovrà essere riproducibile. </w:t>
-      </w:r>
-    </w:p>
-    <w:p>
-      <w:r>
-        <w:t>In questa parte è richiesto l’inserimento di codice sorgente</w:t>
-      </w:r>
-      <w:r>
-        <w:t xml:space="preserve"> - </w:t>
-      </w:r>
-      <w:r>
-        <w:t>P</w:t>
-      </w:r>
-      <w:r>
-        <w:t xml:space="preserve">rint </w:t>
-      </w:r>
-      <w:r>
-        <w:t>S</w:t>
-      </w:r>
-      <w:r>
-        <w:t xml:space="preserve">creen </w:t>
-      </w:r>
-      <w:r>
-        <w:t xml:space="preserve">- </w:t>
-      </w:r>
-      <w:r>
-        <w:t>di maschere solamente per quei passaggi particolarmente significativi e/o critici.</w:t>
-      </w:r>
-    </w:p>
-    <w:p>
-      <w:r>
-        <w:t>Inoltre,</w:t>
-      </w:r>
-      <w:r>
-        <w:t xml:space="preserve"> dovranno essere descritte eventuali varianti di soluzione o scelte di prodotti con motivazione delle scelte.</w:t>
-      </w:r>
-    </w:p>
-    <w:p>
-      <w:r>
-        <w:t>Non deve apparire nessuna forma di guida d’uso di librerie o di componenti utilizzati. Eventualmente questa va allegata.</w:t>
-      </w:r>
-    </w:p>
-    <w:p>
-      <w:r>
-        <w:t>Per eventuali dettagli si possono inserire riferimenti ai diari.</w:t>
-      </w:r>
-    </w:p>
-    <w:p>
-      <w:pPr>
-        <w:pStyle w:val="Titolo1"/>
-        <w:rPr>
-          <w:lang w:val="it-IT"/>
-        </w:rPr>
-      </w:pPr>
-      <w:bookmarkStart w:id="27" w:name="_Toc461179223"/>
-      <w:bookmarkStart w:id="28" w:name="_Toc94790460"/>
-      <w:r>
-        <w:rPr>
-          <w:lang w:val="it-IT"/>
-        </w:rPr>
-        <w:t>Test</w:t>
+      <w:pPr>
+        <w:pStyle w:val="Titolo2"/>
+      </w:pPr>
+      <w:bookmarkStart w:id="27" w:name="_Toc461179224"/>
+      <w:bookmarkStart w:id="28" w:name="_Toc94790461"/>
+      <w:r>
+        <w:t>Protocollo di test</w:t>
       </w:r>
       <w:bookmarkEnd w:id="27"/>
       <w:bookmarkEnd w:id="28"/>
-    </w:p>
-    <w:p>
-      <w:pPr>
-        <w:pStyle w:val="Titolo2"/>
-      </w:pPr>
-      <w:bookmarkStart w:id="29" w:name="_Toc461179224"/>
-      <w:bookmarkStart w:id="30" w:name="_Toc94790461"/>
-      <w:r>
-        <w:t>Protocollo di test</w:t>
-      </w:r>
-      <w:bookmarkEnd w:id="29"/>
-      <w:bookmarkEnd w:id="30"/>
     </w:p>
     <w:p>
       <w:pPr>
@@ -13057,7 +13460,7 @@
           <w:lang w:val="it-IT"/>
         </w:rPr>
       </w:pPr>
-      <w:bookmarkStart w:id="31" w:name="_Toc461179225"/>
+      <w:bookmarkStart w:id="29" w:name="_Toc461179225"/>
       <w:r>
         <w:br w:type="page"/>
       </w:r>
@@ -13066,11 +13469,39 @@
       <w:pPr>
         <w:pStyle w:val="Titolo2"/>
       </w:pPr>
-      <w:bookmarkStart w:id="32" w:name="_Toc94790462"/>
+      <w:bookmarkStart w:id="30" w:name="_Toc94790462"/>
       <w:r>
         <w:lastRenderedPageBreak/>
         <w:t>Risultati test</w:t>
       </w:r>
+      <w:bookmarkEnd w:id="29"/>
+      <w:bookmarkEnd w:id="30"/>
+    </w:p>
+    <w:p>
+      <w:pPr>
+        <w:rPr>
+          <w:lang w:val="it-IT"/>
+        </w:rPr>
+      </w:pPr>
+      <w:r>
+        <w:rPr>
+          <w:lang w:val="it-IT"/>
+        </w:rPr>
+        <w:t>Tabella riassuntiva in cui si inseriscono i test riusciti e non del prodotto finale. Se un test non riesce e viene corretto l’errore, questo dovrà risultare nel documento finale come riuscito (la procedura della correzione apparirà nel diario), altrimenti dovrà essere descritto l’errore con eventuali ipotesi di correzione.</w:t>
+      </w:r>
+    </w:p>
+    <w:p>
+      <w:pPr>
+        <w:pStyle w:val="Titolo2"/>
+      </w:pPr>
+      <w:bookmarkStart w:id="31" w:name="_Toc461179226"/>
+      <w:bookmarkStart w:id="32" w:name="_Toc94790463"/>
+      <w:r>
+        <w:t>Mancanze</w:t>
+      </w:r>
+      <w:r>
+        <w:t>/limitazioni conosciute</w:t>
+      </w:r>
       <w:bookmarkEnd w:id="31"/>
       <w:bookmarkEnd w:id="32"/>
     </w:p>
@@ -13084,20 +13515,23 @@
         <w:rPr>
           <w:lang w:val="it-IT"/>
         </w:rPr>
-        <w:t>Tabella riassuntiva in cui si inseriscono i test riusciti e non del prodotto finale. Se un test non riesce e viene corretto l’errore, questo dovrà risultare nel documento finale come riuscito (la procedura della correzione apparirà nel diario), altrimenti dovrà essere descritto l’errore con eventuali ipotesi di correzione.</w:t>
-      </w:r>
-    </w:p>
-    <w:p>
-      <w:pPr>
-        <w:pStyle w:val="Titolo2"/>
-      </w:pPr>
-      <w:bookmarkStart w:id="33" w:name="_Toc461179226"/>
-      <w:bookmarkStart w:id="34" w:name="_Toc94790463"/>
-      <w:r>
-        <w:t>Mancanze</w:t>
-      </w:r>
-      <w:r>
-        <w:t>/limitazioni conosciute</w:t>
+        <w:t>Descrizione con motivazione di eventuali elementi mancanti o non completamente implementati, al di fuori dei test case. Non devono essere riportati gli errori e i problemi riscontrati e poi risolti durante il progetto.</w:t>
+      </w:r>
+    </w:p>
+    <w:p>
+      <w:pPr>
+        <w:pStyle w:val="Titolo1"/>
+        <w:rPr>
+          <w:lang w:val="it-IT"/>
+        </w:rPr>
+      </w:pPr>
+      <w:bookmarkStart w:id="33" w:name="_Toc461179227"/>
+      <w:bookmarkStart w:id="34" w:name="_Toc94790464"/>
+      <w:r>
+        <w:rPr>
+          <w:lang w:val="it-IT"/>
+        </w:rPr>
+        <w:t>Consuntivo</w:t>
       </w:r>
       <w:bookmarkEnd w:id="33"/>
       <w:bookmarkEnd w:id="34"/>
@@ -13112,7 +13546,31 @@
         <w:rPr>
           <w:lang w:val="it-IT"/>
         </w:rPr>
-        <w:t>Descrizione con motivazione di eventuali elementi mancanti o non completamente implementati, al di fuori dei test case. Non devono essere riportati gli errori e i problemi riscontrati e poi risolti durante il progetto.</w:t>
+        <w:t>Consuntivo del tempo di lavoro effettivo e considerazioni riguardo le differenze rispetto alla pianificazione (cap</w:t>
+      </w:r>
+      <w:r>
+        <w:rPr>
+          <w:lang w:val="it-IT"/>
+        </w:rPr>
+        <w:t>.</w:t>
+      </w:r>
+      <w:r>
+        <w:rPr>
+          <w:lang w:val="it-IT"/>
+        </w:rPr>
+        <w:t xml:space="preserve"> 1.7) (ad esempio Gan</w:t>
+      </w:r>
+      <w:r>
+        <w:rPr>
+          <w:lang w:val="it-IT"/>
+        </w:rPr>
+        <w:t>t</w:t>
+      </w:r>
+      <w:r>
+        <w:rPr>
+          <w:lang w:val="it-IT"/>
+        </w:rPr>
+        <w:t>t consuntivo).</w:t>
       </w:r>
     </w:p>
     <w:p>
@@ -13122,13 +13580,13 @@
           <w:lang w:val="it-IT"/>
         </w:rPr>
       </w:pPr>
-      <w:bookmarkStart w:id="35" w:name="_Toc461179227"/>
-      <w:bookmarkStart w:id="36" w:name="_Toc94790464"/>
-      <w:r>
-        <w:rPr>
-          <w:lang w:val="it-IT"/>
-        </w:rPr>
-        <w:t>Consuntivo</w:t>
+      <w:bookmarkStart w:id="35" w:name="_Toc461179228"/>
+      <w:bookmarkStart w:id="36" w:name="_Toc94790465"/>
+      <w:r>
+        <w:rPr>
+          <w:lang w:val="it-IT"/>
+        </w:rPr>
+        <w:t>Conclusioni</w:t>
       </w:r>
       <w:bookmarkEnd w:id="35"/>
       <w:bookmarkEnd w:id="36"/>
@@ -13143,7 +13601,73 @@
         <w:rPr>
           <w:lang w:val="it-IT"/>
         </w:rPr>
-        <w:t>Consuntivo del tempo di lavoro effettivo e considerazioni riguardo le differenze rispetto alla pianificazione (cap</w:t>
+        <w:t>Quali sono le implicazioni della mia soluzione? Che impatto avrà?</w:t>
+      </w:r>
+      <w:r>
+        <w:rPr>
+          <w:lang w:val="it-IT"/>
+        </w:rPr>
+        <w:t xml:space="preserve"> Cambierà il mondo? È un successo importante? È </w:t>
+      </w:r>
+      <w:r>
+        <w:rPr>
+          <w:lang w:val="it-IT"/>
+        </w:rPr>
+        <w:t>solo un</w:t>
+      </w:r>
+      <w:r>
+        <w:rPr>
+          <w:lang w:val="it-IT"/>
+        </w:rPr>
+        <w:t>’</w:t>
+      </w:r>
+      <w:r>
+        <w:rPr>
+          <w:lang w:val="it-IT"/>
+        </w:rPr>
+        <w:t>aggiunta</w:t>
+      </w:r>
+      <w:r>
+        <w:rPr>
+          <w:lang w:val="it-IT"/>
+        </w:rPr>
+        <w:t xml:space="preserve"> marginale o</w:t>
+      </w:r>
+      <w:r>
+        <w:rPr>
+          <w:lang w:val="it-IT"/>
+        </w:rPr>
+        <w:t xml:space="preserve"> è semplicemente servita per scoprire che questo percorso è</w:t>
+      </w:r>
+      <w:r>
+        <w:rPr>
+          <w:lang w:val="it-IT"/>
+        </w:rPr>
+        <w:t xml:space="preserve"> stato</w:t>
+      </w:r>
+      <w:r>
+        <w:rPr>
+          <w:lang w:val="it-IT"/>
+        </w:rPr>
+        <w:t xml:space="preserve"> una perdita di tempo? I ris</w:t>
+      </w:r>
+      <w:r>
+        <w:rPr>
+          <w:lang w:val="it-IT"/>
+        </w:rPr>
+        <w:t xml:space="preserve">ultati ottenuti sono generali, </w:t>
+      </w:r>
+      <w:r>
+        <w:rPr>
+          <w:lang w:val="it-IT"/>
+        </w:rPr>
+        <w:t>facilmente generalizzabili o sono specifici di un caso particolare?</w:t>
+      </w:r>
+      <w:r>
+        <w:rPr>
+          <w:lang w:val="it-IT"/>
+        </w:rPr>
+        <w:t xml:space="preserve"> ecc</w:t>
       </w:r>
       <w:r>
         <w:rPr>
@@ -13151,39 +13675,15 @@
         </w:rPr>
         <w:t>.</w:t>
       </w:r>
-      <w:r>
-        <w:rPr>
-          <w:lang w:val="it-IT"/>
-        </w:rPr>
-        <w:t xml:space="preserve"> 1.7) (ad esempio Gan</w:t>
-      </w:r>
-      <w:r>
-        <w:rPr>
-          <w:lang w:val="it-IT"/>
-        </w:rPr>
-        <w:t>t</w:t>
-      </w:r>
-      <w:r>
-        <w:rPr>
-          <w:lang w:val="it-IT"/>
-        </w:rPr>
-        <w:t>t consuntivo).</w:t>
-      </w:r>
-    </w:p>
-    <w:p>
-      <w:pPr>
-        <w:pStyle w:val="Titolo1"/>
-        <w:rPr>
-          <w:lang w:val="it-IT"/>
-        </w:rPr>
-      </w:pPr>
-      <w:bookmarkStart w:id="37" w:name="_Toc461179228"/>
-      <w:bookmarkStart w:id="38" w:name="_Toc94790465"/>
-      <w:r>
-        <w:rPr>
-          <w:lang w:val="it-IT"/>
-        </w:rPr>
-        <w:t>Conclusioni</w:t>
+    </w:p>
+    <w:p>
+      <w:pPr>
+        <w:pStyle w:val="Titolo2"/>
+      </w:pPr>
+      <w:bookmarkStart w:id="37" w:name="_Toc461179229"/>
+      <w:bookmarkStart w:id="38" w:name="_Toc94790466"/>
+      <w:r>
+        <w:t>Sviluppi futuri</w:t>
       </w:r>
       <w:bookmarkEnd w:id="37"/>
       <w:bookmarkEnd w:id="38"/>
@@ -13198,89 +13698,17 @@
         <w:rPr>
           <w:lang w:val="it-IT"/>
         </w:rPr>
-        <w:t>Quali sono le implicazioni della mia soluzione? Che impatto avrà?</w:t>
-      </w:r>
-      <w:r>
-        <w:rPr>
-          <w:lang w:val="it-IT"/>
-        </w:rPr>
-        <w:t xml:space="preserve"> Cambierà il mondo? È un successo importante? È </w:t>
-      </w:r>
-      <w:r>
-        <w:rPr>
-          <w:lang w:val="it-IT"/>
-        </w:rPr>
-        <w:t>solo un</w:t>
-      </w:r>
-      <w:r>
-        <w:rPr>
-          <w:lang w:val="it-IT"/>
-        </w:rPr>
-        <w:t>’</w:t>
-      </w:r>
-      <w:r>
-        <w:rPr>
-          <w:lang w:val="it-IT"/>
-        </w:rPr>
-        <w:t>aggiunta</w:t>
-      </w:r>
-      <w:r>
-        <w:rPr>
-          <w:lang w:val="it-IT"/>
-        </w:rPr>
-        <w:t xml:space="preserve"> marginale o</w:t>
-      </w:r>
-      <w:r>
-        <w:rPr>
-          <w:lang w:val="it-IT"/>
-        </w:rPr>
-        <w:t xml:space="preserve"> è semplicemente servita per scoprire che questo percorso è</w:t>
-      </w:r>
-      <w:r>
-        <w:rPr>
-          <w:lang w:val="it-IT"/>
-        </w:rPr>
-        <w:t xml:space="preserve"> stato</w:t>
-      </w:r>
-      <w:r>
-        <w:rPr>
-          <w:lang w:val="it-IT"/>
-        </w:rPr>
-        <w:t xml:space="preserve"> una perdita di tempo? I ris</w:t>
-      </w:r>
-      <w:r>
-        <w:rPr>
-          <w:lang w:val="it-IT"/>
-        </w:rPr>
-        <w:t xml:space="preserve">ultati ottenuti sono generali, </w:t>
-      </w:r>
-      <w:r>
-        <w:rPr>
-          <w:lang w:val="it-IT"/>
-        </w:rPr>
-        <w:t>facilmente generalizzabili o sono specifici di un caso particolare?</w:t>
-      </w:r>
-      <w:r>
-        <w:rPr>
-          <w:lang w:val="it-IT"/>
-        </w:rPr>
-        <w:t xml:space="preserve"> ecc</w:t>
-      </w:r>
-      <w:r>
-        <w:rPr>
-          <w:lang w:val="it-IT"/>
-        </w:rPr>
-        <w:t>.</w:t>
+        <w:t>Migliorie o estensioni che possono essere sviluppate sul prodotto.</w:t>
       </w:r>
     </w:p>
     <w:p>
       <w:pPr>
         <w:pStyle w:val="Titolo2"/>
       </w:pPr>
-      <w:bookmarkStart w:id="39" w:name="_Toc461179229"/>
-      <w:bookmarkStart w:id="40" w:name="_Toc94790466"/>
-      <w:r>
-        <w:t>Sviluppi futuri</w:t>
+      <w:bookmarkStart w:id="39" w:name="_Toc461179230"/>
+      <w:bookmarkStart w:id="40" w:name="_Toc94790467"/>
+      <w:r>
+        <w:t>Considerazioni personali</w:t>
       </w:r>
       <w:bookmarkEnd w:id="39"/>
       <w:bookmarkEnd w:id="40"/>
@@ -13295,56 +13723,31 @@
         <w:rPr>
           <w:lang w:val="it-IT"/>
         </w:rPr>
-        <w:t>Migliorie o estensioni che possono essere sviluppate sul prodotto.</w:t>
-      </w:r>
-    </w:p>
-    <w:p>
-      <w:pPr>
-        <w:pStyle w:val="Titolo2"/>
-      </w:pPr>
-      <w:bookmarkStart w:id="41" w:name="_Toc461179230"/>
-      <w:bookmarkStart w:id="42" w:name="_Toc94790467"/>
-      <w:r>
-        <w:t>Considerazioni personali</w:t>
+        <w:t>Cosa ho imparato in questo progetto? ecc</w:t>
+      </w:r>
+      <w:r>
+        <w:rPr>
+          <w:lang w:val="it-IT"/>
+        </w:rPr>
+        <w:t>.</w:t>
+      </w:r>
+    </w:p>
+    <w:p>
+      <w:pPr>
+        <w:pStyle w:val="Titolo1"/>
+        <w:rPr>
+          <w:lang w:val="it-IT"/>
+        </w:rPr>
+      </w:pPr>
+      <w:bookmarkStart w:id="41" w:name="_Toc94790468"/>
+      <w:bookmarkStart w:id="42" w:name="_Toc461179232"/>
+      <w:r>
+        <w:rPr>
+          <w:lang w:val="it-IT"/>
+        </w:rPr>
+        <w:t>Glossario</w:t>
       </w:r>
       <w:bookmarkEnd w:id="41"/>
-      <w:bookmarkEnd w:id="42"/>
-    </w:p>
-    <w:p>
-      <w:pPr>
-        <w:rPr>
-          <w:lang w:val="it-IT"/>
-        </w:rPr>
-      </w:pPr>
-      <w:r>
-        <w:rPr>
-          <w:lang w:val="it-IT"/>
-        </w:rPr>
-        <w:t>Cosa ho imparato in questo progetto? ecc</w:t>
-      </w:r>
-      <w:r>
-        <w:rPr>
-          <w:lang w:val="it-IT"/>
-        </w:rPr>
-        <w:t>.</w:t>
-      </w:r>
-    </w:p>
-    <w:p>
-      <w:pPr>
-        <w:pStyle w:val="Titolo1"/>
-        <w:rPr>
-          <w:lang w:val="it-IT"/>
-        </w:rPr>
-      </w:pPr>
-      <w:bookmarkStart w:id="43" w:name="_Toc94790468"/>
-      <w:bookmarkStart w:id="44" w:name="_Toc461179232"/>
-      <w:r>
-        <w:rPr>
-          <w:lang w:val="it-IT"/>
-        </w:rPr>
-        <w:t>Glossario</w:t>
-      </w:r>
-      <w:bookmarkEnd w:id="43"/>
     </w:p>
     <w:p>
       <w:pPr>
@@ -13570,7 +13973,7 @@
           <w:lang w:val="it-IT"/>
         </w:rPr>
       </w:pPr>
-      <w:bookmarkStart w:id="45" w:name="_Toc94790469"/>
+      <w:bookmarkStart w:id="43" w:name="_Toc94790469"/>
       <w:r>
         <w:rPr>
           <w:lang w:val="it-IT"/>
@@ -13592,18 +13995,18 @@
         <w:lastRenderedPageBreak/>
         <w:t>Bibliografia</w:t>
       </w:r>
-      <w:bookmarkEnd w:id="45"/>
+      <w:bookmarkEnd w:id="43"/>
     </w:p>
     <w:p>
       <w:pPr>
         <w:pStyle w:val="Titolo2"/>
       </w:pPr>
-      <w:bookmarkStart w:id="46" w:name="_Toc94790470"/>
+      <w:bookmarkStart w:id="44" w:name="_Toc94790470"/>
       <w:r>
         <w:t>Bibliografia per articoli di riviste:</w:t>
       </w:r>
+      <w:bookmarkEnd w:id="42"/>
       <w:bookmarkEnd w:id="44"/>
-      <w:bookmarkEnd w:id="46"/>
     </w:p>
     <w:p>
       <w:pPr>
@@ -13712,13 +14115,13 @@
       <w:pPr>
         <w:pStyle w:val="Titolo2"/>
       </w:pPr>
-      <w:bookmarkStart w:id="47" w:name="_Toc461179233"/>
-      <w:bookmarkStart w:id="48" w:name="_Toc94790471"/>
+      <w:bookmarkStart w:id="45" w:name="_Toc461179233"/>
+      <w:bookmarkStart w:id="46" w:name="_Toc94790471"/>
       <w:r>
         <w:t>Bibliografia per libri</w:t>
       </w:r>
-      <w:bookmarkEnd w:id="47"/>
-      <w:bookmarkEnd w:id="48"/>
+      <w:bookmarkEnd w:id="45"/>
+      <w:bookmarkEnd w:id="46"/>
     </w:p>
     <w:p>
       <w:pPr>
@@ -13843,18 +14246,18 @@
           <w:lang w:val="it-IT"/>
         </w:rPr>
       </w:pPr>
-      <w:bookmarkStart w:id="49" w:name="_Toc461179234"/>
+      <w:bookmarkStart w:id="47" w:name="_Toc461179234"/>
     </w:p>
     <w:p>
       <w:pPr>
         <w:pStyle w:val="Titolo2"/>
       </w:pPr>
-      <w:bookmarkStart w:id="50" w:name="_Toc94790472"/>
+      <w:bookmarkStart w:id="48" w:name="_Toc94790472"/>
       <w:r>
         <w:t>Sitografia</w:t>
       </w:r>
-      <w:bookmarkEnd w:id="49"/>
-      <w:bookmarkEnd w:id="50"/>
+      <w:bookmarkEnd w:id="47"/>
+      <w:bookmarkEnd w:id="48"/>
     </w:p>
     <w:p>
       <w:pPr>
@@ -14012,16 +14415,16 @@
           <w:lang w:val="it-IT"/>
         </w:rPr>
       </w:pPr>
-      <w:bookmarkStart w:id="51" w:name="_Toc461179235"/>
-      <w:bookmarkStart w:id="52" w:name="_Toc94790473"/>
+      <w:bookmarkStart w:id="49" w:name="_Toc461179235"/>
+      <w:bookmarkStart w:id="50" w:name="_Toc94790473"/>
       <w:r>
         <w:rPr>
           <w:lang w:val="it-IT"/>
         </w:rPr>
         <w:t>Allegati</w:t>
       </w:r>
-      <w:bookmarkEnd w:id="51"/>
-      <w:bookmarkEnd w:id="52"/>
+      <w:bookmarkEnd w:id="49"/>
+      <w:bookmarkEnd w:id="50"/>
     </w:p>
     <w:p>
       <w:pPr>
@@ -14194,12 +14597,12 @@
       </w:pPr>
     </w:p>
     <w:sectPr>
-      <w:headerReference w:type="even" r:id="rId9"/>
-      <w:headerReference w:type="default" r:id="rId10"/>
-      <w:footerReference w:type="even" r:id="rId11"/>
-      <w:footerReference w:type="default" r:id="rId12"/>
-      <w:headerReference w:type="first" r:id="rId13"/>
-      <w:footerReference w:type="first" r:id="rId14"/>
+      <w:headerReference w:type="even" r:id="rId13"/>
+      <w:headerReference w:type="default" r:id="rId14"/>
+      <w:footerReference w:type="even" r:id="rId15"/>
+      <w:footerReference w:type="default" r:id="rId16"/>
+      <w:headerReference w:type="first" r:id="rId17"/>
+      <w:footerReference w:type="first" r:id="rId18"/>
       <w:pgSz w:w="11906" w:h="16838"/>
       <w:pgMar w:top="1985" w:right="1134" w:bottom="1418" w:left="1134" w:header="567" w:footer="567" w:gutter="0"/>
       <w:pgNumType w:start="1"/>
@@ -19030,15 +19433,6 @@
   </w:num>
   <w:num w:numId="36" w16cid:durableId="148602091">
     <w:abstractNumId w:val="23"/>
-    <w:lvlOverride w:ilvl="0"/>
-    <w:lvlOverride w:ilvl="1"/>
-    <w:lvlOverride w:ilvl="2"/>
-    <w:lvlOverride w:ilvl="3"/>
-    <w:lvlOverride w:ilvl="4"/>
-    <w:lvlOverride w:ilvl="5"/>
-    <w:lvlOverride w:ilvl="6"/>
-    <w:lvlOverride w:ilvl="7"/>
-    <w:lvlOverride w:ilvl="8"/>
   </w:num>
   <w:numIdMacAtCleanup w:val="14"/>
 </w:numbering>

</xml_diff>